<commit_message>
fitur qr code di V1
</commit_message>
<xml_diff>
--- a/frontend/templates/template_1779824162130-374655981.docx
+++ b/frontend/templates/template_1779824162130-374655981.docx
@@ -71,7 +71,6 @@
         </w:rPr>
         <w:t>{</w:t>
       </w:r>
-      <w:proofErr w:type="spellStart"/>
       <w:r>
         <w:rPr>
           <w:sz w:val="22"/>
@@ -79,7 +78,6 @@
         </w:rPr>
         <w:t>prodi-tertuju</w:t>
       </w:r>
-      <w:proofErr w:type="spellEnd"/>
       <w:r>
         <w:rPr>
           <w:sz w:val="22"/>
@@ -131,17 +129,8 @@
           <w:sz w:val="22"/>
           <w:szCs w:val="22"/>
         </w:rPr>
-        <w:t xml:space="preserve">di </w:t>
-      </w:r>
-      <w:proofErr w:type="spellStart"/>
-      <w:r>
-        <w:rPr>
-          <w:sz w:val="22"/>
-          <w:szCs w:val="22"/>
-        </w:rPr>
-        <w:t>Tempat</w:t>
-      </w:r>
-      <w:proofErr w:type="spellEnd"/>
+        <w:t>di Tempat</w:t>
+      </w:r>
     </w:p>
     <w:p>
       <w:pPr>
@@ -182,71 +171,7 @@
           <w:sz w:val="22"/>
           <w:szCs w:val="22"/>
         </w:rPr>
-        <w:t xml:space="preserve">Yang </w:t>
-      </w:r>
-      <w:proofErr w:type="spellStart"/>
-      <w:r>
-        <w:rPr>
-          <w:sz w:val="22"/>
-          <w:szCs w:val="22"/>
-        </w:rPr>
-        <w:t>bertanda</w:t>
-      </w:r>
-      <w:proofErr w:type="spellEnd"/>
-      <w:r>
-        <w:rPr>
-          <w:sz w:val="22"/>
-          <w:szCs w:val="22"/>
-        </w:rPr>
-        <w:t xml:space="preserve"> </w:t>
-      </w:r>
-      <w:proofErr w:type="spellStart"/>
-      <w:r>
-        <w:rPr>
-          <w:sz w:val="22"/>
-          <w:szCs w:val="22"/>
-        </w:rPr>
-        <w:t>tangan</w:t>
-      </w:r>
-      <w:proofErr w:type="spellEnd"/>
-      <w:r>
-        <w:rPr>
-          <w:sz w:val="22"/>
-          <w:szCs w:val="22"/>
-        </w:rPr>
-        <w:t xml:space="preserve"> di </w:t>
-      </w:r>
-      <w:proofErr w:type="spellStart"/>
-      <w:r>
-        <w:rPr>
-          <w:sz w:val="22"/>
-          <w:szCs w:val="22"/>
-        </w:rPr>
-        <w:t>bawah</w:t>
-      </w:r>
-      <w:proofErr w:type="spellEnd"/>
-      <w:r>
-        <w:rPr>
-          <w:sz w:val="22"/>
-          <w:szCs w:val="22"/>
-        </w:rPr>
-        <w:t xml:space="preserve"> </w:t>
-      </w:r>
-      <w:proofErr w:type="spellStart"/>
-      <w:r>
-        <w:rPr>
-          <w:sz w:val="22"/>
-          <w:szCs w:val="22"/>
-        </w:rPr>
-        <w:t>ini</w:t>
-      </w:r>
-      <w:proofErr w:type="spellEnd"/>
-      <w:r>
-        <w:rPr>
-          <w:sz w:val="22"/>
-          <w:szCs w:val="22"/>
-        </w:rPr>
-        <w:t>,</w:t>
+        <w:t>Yang bertanda tangan di bawah ini,</w:t>
       </w:r>
     </w:p>
     <w:p>
@@ -310,17 +235,8 @@
                 <w:sz w:val="22"/>
                 <w:szCs w:val="22"/>
               </w:rPr>
-              <w:t xml:space="preserve">Nama </w:t>
-            </w:r>
-            <w:proofErr w:type="spellStart"/>
-            <w:r>
-              <w:rPr>
-                <w:sz w:val="22"/>
-                <w:szCs w:val="22"/>
-              </w:rPr>
-              <w:t>Mahasiswa</w:t>
-            </w:r>
-            <w:proofErr w:type="spellEnd"/>
+              <w:t>Nama Mahasiswa</w:t>
+            </w:r>
           </w:p>
         </w:tc>
         <w:tc>
@@ -394,7 +310,16 @@
                 <w:sz w:val="22"/>
                 <w:szCs w:val="22"/>
               </w:rPr>
-              <w:t>nama</w:t>
+              <w:t>nam</w:t>
+            </w:r>
+            <w:r>
+              <w:rPr>
+                <w:b/>
+                <w:bCs/>
+                <w:sz w:val="22"/>
+                <w:szCs w:val="22"/>
+              </w:rPr>
+              <w:t>a-mhs</w:t>
             </w:r>
             <w:r>
               <w:rPr>
@@ -623,7 +548,6 @@
               </w:rPr>
               <w:t>{</w:t>
             </w:r>
-            <w:proofErr w:type="spellStart"/>
             <w:r>
               <w:rPr>
                 <w:b/>
@@ -633,7 +557,6 @@
               </w:rPr>
               <w:t>telp</w:t>
             </w:r>
-            <w:proofErr w:type="spellEnd"/>
             <w:r>
               <w:rPr>
                 <w:b/>
@@ -745,7 +668,6 @@
               </w:rPr>
               <w:t>{</w:t>
             </w:r>
-            <w:proofErr w:type="spellStart"/>
             <w:r>
               <w:rPr>
                 <w:b/>
@@ -753,9 +675,8 @@
                 <w:sz w:val="22"/>
                 <w:szCs w:val="22"/>
               </w:rPr>
-              <w:t>sks-ipk</w:t>
-            </w:r>
-            <w:proofErr w:type="spellEnd"/>
+              <w:t>sks</w:t>
+            </w:r>
             <w:r>
               <w:rPr>
                 <w:b/>
@@ -764,6 +685,15 @@
                 <w:szCs w:val="22"/>
               </w:rPr>
               <w:t>}</w:t>
+            </w:r>
+            <w:r>
+              <w:rPr>
+                <w:b/>
+                <w:bCs/>
+                <w:sz w:val="22"/>
+                <w:szCs w:val="22"/>
+              </w:rPr>
+              <w:t xml:space="preserve"> / {ipk} </w:t>
             </w:r>
           </w:p>
           <w:p>
@@ -785,79 +715,13 @@
           <w:szCs w:val="22"/>
         </w:rPr>
       </w:pPr>
-      <w:proofErr w:type="spellStart"/>
-      <w:r>
-        <w:rPr>
-          <w:sz w:val="22"/>
-          <w:szCs w:val="22"/>
-        </w:rPr>
-        <w:t>dengan</w:t>
-      </w:r>
-      <w:proofErr w:type="spellEnd"/>
-      <w:r>
-        <w:rPr>
-          <w:sz w:val="22"/>
-          <w:szCs w:val="22"/>
-        </w:rPr>
-        <w:t xml:space="preserve"> </w:t>
-      </w:r>
-      <w:proofErr w:type="spellStart"/>
-      <w:r>
-        <w:rPr>
-          <w:sz w:val="22"/>
-          <w:szCs w:val="22"/>
-        </w:rPr>
-        <w:t>surat</w:t>
-      </w:r>
-      <w:proofErr w:type="spellEnd"/>
-      <w:r>
-        <w:rPr>
-          <w:sz w:val="22"/>
-          <w:szCs w:val="22"/>
-        </w:rPr>
-        <w:t xml:space="preserve"> </w:t>
-      </w:r>
-      <w:proofErr w:type="spellStart"/>
-      <w:r>
-        <w:rPr>
-          <w:sz w:val="22"/>
-          <w:szCs w:val="22"/>
-        </w:rPr>
-        <w:t>ini</w:t>
-      </w:r>
-      <w:proofErr w:type="spellEnd"/>
-      <w:r>
-        <w:rPr>
-          <w:sz w:val="22"/>
-          <w:szCs w:val="22"/>
-        </w:rPr>
-        <w:t xml:space="preserve"> </w:t>
-      </w:r>
-      <w:proofErr w:type="spellStart"/>
-      <w:r>
-        <w:rPr>
-          <w:sz w:val="22"/>
-          <w:szCs w:val="22"/>
-        </w:rPr>
-        <w:t>mengajukan</w:t>
-      </w:r>
-      <w:proofErr w:type="spellEnd"/>
-      <w:r>
-        <w:rPr>
-          <w:sz w:val="22"/>
-          <w:szCs w:val="22"/>
-        </w:rPr>
-        <w:t xml:space="preserve"> permohonan dapat melaksanakan penyusunan Tugas Akhir / Skripsi dengan </w:t>
-      </w:r>
-      <w:proofErr w:type="gramStart"/>
-      <w:r>
-        <w:rPr>
-          <w:sz w:val="22"/>
-          <w:szCs w:val="22"/>
-        </w:rPr>
-        <w:t>judul :</w:t>
-      </w:r>
-      <w:proofErr w:type="gramEnd"/>
+      <w:r>
+        <w:rPr>
+          <w:sz w:val="22"/>
+          <w:szCs w:val="22"/>
+        </w:rPr>
+        <w:t>dengan surat ini mengajukan permohonan dapat melaksanakan penyusunan Tugas Akhir / Skripsi dengan judul :</w:t>
+      </w:r>
     </w:p>
     <w:p>
       <w:pPr>
@@ -886,27 +750,7 @@
           <w:sz w:val="22"/>
           <w:szCs w:val="22"/>
         </w:rPr>
-        <w:t>{</w:t>
-      </w:r>
-      <w:proofErr w:type="spellStart"/>
-      <w:r>
-        <w:rPr>
-          <w:i/>
-          <w:iCs/>
-          <w:sz w:val="22"/>
-          <w:szCs w:val="22"/>
-        </w:rPr>
-        <w:t>judul</w:t>
-      </w:r>
-      <w:proofErr w:type="spellEnd"/>
-      <w:r>
-        <w:rPr>
-          <w:i/>
-          <w:iCs/>
-          <w:sz w:val="22"/>
-          <w:szCs w:val="22"/>
-        </w:rPr>
-        <w:t>}</w:t>
+        <w:t>{judul}</w:t>
       </w:r>
     </w:p>
     <w:p>
@@ -932,65 +776,8 @@
           <w:sz w:val="22"/>
           <w:szCs w:val="22"/>
         </w:rPr>
-        <w:t xml:space="preserve">Bersama </w:t>
-      </w:r>
-      <w:proofErr w:type="spellStart"/>
-      <w:r>
-        <w:rPr>
-          <w:sz w:val="22"/>
-          <w:szCs w:val="22"/>
-        </w:rPr>
-        <w:t>ini</w:t>
-      </w:r>
-      <w:proofErr w:type="spellEnd"/>
-      <w:r>
-        <w:rPr>
-          <w:sz w:val="22"/>
-          <w:szCs w:val="22"/>
-        </w:rPr>
-        <w:t xml:space="preserve"> pula </w:t>
-      </w:r>
-      <w:proofErr w:type="spellStart"/>
-      <w:r>
-        <w:rPr>
-          <w:sz w:val="22"/>
-          <w:szCs w:val="22"/>
-        </w:rPr>
-        <w:t>saya</w:t>
-      </w:r>
-      <w:proofErr w:type="spellEnd"/>
-      <w:r>
-        <w:rPr>
-          <w:sz w:val="22"/>
-          <w:szCs w:val="22"/>
-        </w:rPr>
-        <w:t xml:space="preserve"> </w:t>
-      </w:r>
-      <w:proofErr w:type="spellStart"/>
-      <w:r>
-        <w:rPr>
-          <w:sz w:val="22"/>
-          <w:szCs w:val="22"/>
-        </w:rPr>
-        <w:t>lampirkan</w:t>
-      </w:r>
-      <w:proofErr w:type="spellEnd"/>
-      <w:r>
-        <w:rPr>
-          <w:sz w:val="22"/>
-          <w:szCs w:val="22"/>
-        </w:rPr>
-        <w:t xml:space="preserve"> persyaratan sebagai </w:t>
-      </w:r>
-      <w:proofErr w:type="gramStart"/>
-      <w:r>
-        <w:rPr>
-          <w:sz w:val="22"/>
-          <w:szCs w:val="22"/>
-        </w:rPr>
-        <w:t>berikut :</w:t>
-      </w:r>
-      <w:proofErr w:type="gramEnd"/>
+        <w:t>Bersama ini pula saya lampirkan persyaratan sebagai berikut :</w:t>
+      </w:r>
     </w:p>
     <w:tbl>
       <w:tblPr>
@@ -1295,55 +1082,7 @@
                 <w:sz w:val="22"/>
                 <w:szCs w:val="22"/>
               </w:rPr>
-              <w:t xml:space="preserve">Kartu </w:t>
-            </w:r>
-            <w:proofErr w:type="spellStart"/>
-            <w:r>
-              <w:rPr>
-                <w:sz w:val="22"/>
-                <w:szCs w:val="22"/>
-              </w:rPr>
-              <w:t>Mahasiswa</w:t>
-            </w:r>
-            <w:proofErr w:type="spellEnd"/>
-            <w:r>
-              <w:rPr>
-                <w:sz w:val="22"/>
-                <w:szCs w:val="22"/>
-              </w:rPr>
-              <w:t xml:space="preserve"> yang </w:t>
-            </w:r>
-            <w:proofErr w:type="spellStart"/>
-            <w:r>
-              <w:rPr>
-                <w:sz w:val="22"/>
-                <w:szCs w:val="22"/>
-              </w:rPr>
-              <w:t>masih</w:t>
-            </w:r>
-            <w:proofErr w:type="spellEnd"/>
-            <w:r>
-              <w:rPr>
-                <w:sz w:val="22"/>
-                <w:szCs w:val="22"/>
-              </w:rPr>
-              <w:t xml:space="preserve"> </w:t>
-            </w:r>
-            <w:proofErr w:type="spellStart"/>
-            <w:r>
-              <w:rPr>
-                <w:sz w:val="22"/>
-                <w:szCs w:val="22"/>
-              </w:rPr>
-              <w:t>berlaku</w:t>
-            </w:r>
-            <w:proofErr w:type="spellEnd"/>
-            <w:r>
-              <w:rPr>
-                <w:sz w:val="22"/>
-                <w:szCs w:val="22"/>
-              </w:rPr>
-              <w:t xml:space="preserve"> (Asli</w:t>
+              <w:t>Kartu Mahasiswa yang masih berlaku (Asli</w:t>
             </w:r>
             <w:r>
               <w:rPr>
@@ -1357,33 +1096,8 @@
                 <w:sz w:val="22"/>
                 <w:szCs w:val="22"/>
               </w:rPr>
-              <w:t xml:space="preserve"> </w:t>
-            </w:r>
-            <w:proofErr w:type="spellStart"/>
-            <w:r>
-              <w:rPr>
-                <w:sz w:val="22"/>
-                <w:szCs w:val="22"/>
-              </w:rPr>
-              <w:t>untuk</w:t>
-            </w:r>
-            <w:proofErr w:type="spellEnd"/>
-            <w:r>
-              <w:rPr>
-                <w:sz w:val="22"/>
-                <w:szCs w:val="22"/>
-              </w:rPr>
-              <w:t xml:space="preserve"> </w:t>
-            </w:r>
-            <w:proofErr w:type="spellStart"/>
-            <w:r>
-              <w:rPr>
-                <w:sz w:val="22"/>
-                <w:szCs w:val="22"/>
-              </w:rPr>
-              <w:t>ditunjukkan</w:t>
-            </w:r>
-            <w:proofErr w:type="spellEnd"/>
+              <w:t xml:space="preserve"> untuk ditunjukkan</w:t>
+            </w:r>
           </w:p>
         </w:tc>
         <w:tc>
@@ -1533,117 +1247,12 @@
           <w:szCs w:val="22"/>
         </w:rPr>
       </w:pPr>
-      <w:proofErr w:type="spellStart"/>
-      <w:r>
-        <w:rPr>
-          <w:sz w:val="22"/>
-          <w:szCs w:val="22"/>
-        </w:rPr>
-        <w:t>Demikian</w:t>
-      </w:r>
-      <w:proofErr w:type="spellEnd"/>
-      <w:r>
-        <w:rPr>
-          <w:sz w:val="22"/>
-          <w:szCs w:val="22"/>
-        </w:rPr>
-        <w:t xml:space="preserve"> </w:t>
-      </w:r>
-      <w:proofErr w:type="spellStart"/>
-      <w:r>
-        <w:rPr>
-          <w:sz w:val="22"/>
-          <w:szCs w:val="22"/>
-        </w:rPr>
-        <w:t>permohonan</w:t>
-      </w:r>
-      <w:proofErr w:type="spellEnd"/>
-      <w:r>
-        <w:rPr>
-          <w:sz w:val="22"/>
-          <w:szCs w:val="22"/>
-        </w:rPr>
-        <w:t xml:space="preserve"> </w:t>
-      </w:r>
-      <w:proofErr w:type="spellStart"/>
-      <w:r>
-        <w:rPr>
-          <w:sz w:val="22"/>
-          <w:szCs w:val="22"/>
-        </w:rPr>
-        <w:t>ini</w:t>
-      </w:r>
-      <w:proofErr w:type="spellEnd"/>
-      <w:r>
-        <w:rPr>
-          <w:sz w:val="22"/>
-          <w:szCs w:val="22"/>
-        </w:rPr>
-        <w:t xml:space="preserve"> </w:t>
-      </w:r>
-      <w:proofErr w:type="spellStart"/>
-      <w:r>
-        <w:rPr>
-          <w:sz w:val="22"/>
-          <w:szCs w:val="22"/>
-        </w:rPr>
-        <w:t>saya</w:t>
-      </w:r>
-      <w:proofErr w:type="spellEnd"/>
-      <w:r>
-        <w:rPr>
-          <w:sz w:val="22"/>
-          <w:szCs w:val="22"/>
-        </w:rPr>
-        <w:t xml:space="preserve"> </w:t>
-      </w:r>
-      <w:proofErr w:type="spellStart"/>
-      <w:r>
-        <w:rPr>
-          <w:sz w:val="22"/>
-          <w:szCs w:val="22"/>
-        </w:rPr>
-        <w:t>sampaikan</w:t>
-      </w:r>
-      <w:proofErr w:type="spellEnd"/>
-      <w:r>
-        <w:rPr>
-          <w:sz w:val="22"/>
-          <w:szCs w:val="22"/>
-        </w:rPr>
-        <w:t xml:space="preserve">, </w:t>
-      </w:r>
-      <w:proofErr w:type="spellStart"/>
-      <w:r>
-        <w:rPr>
-          <w:sz w:val="22"/>
-          <w:szCs w:val="22"/>
-        </w:rPr>
-        <w:t>atas</w:t>
-      </w:r>
-      <w:proofErr w:type="spellEnd"/>
-      <w:r>
-        <w:rPr>
-          <w:sz w:val="22"/>
-          <w:szCs w:val="22"/>
-        </w:rPr>
-        <w:t xml:space="preserve"> </w:t>
-      </w:r>
-      <w:proofErr w:type="spellStart"/>
-      <w:r>
-        <w:rPr>
-          <w:sz w:val="22"/>
-          <w:szCs w:val="22"/>
-        </w:rPr>
-        <w:t>perhatian</w:t>
-      </w:r>
-      <w:proofErr w:type="spellEnd"/>
-      <w:r>
-        <w:rPr>
-          <w:sz w:val="22"/>
-          <w:szCs w:val="22"/>
-        </w:rPr>
-        <w:t xml:space="preserve"> dan perkenannya saya ucapkan terima kasih.</w:t>
+      <w:r>
+        <w:rPr>
+          <w:sz w:val="22"/>
+          <w:szCs w:val="22"/>
+        </w:rPr>
+        <w:t>Demikian permohonan ini saya sampaikan, atas perhatian dan perkenannya saya ucapkan terima kasih.</w:t>
       </w:r>
     </w:p>
     <w:p>
@@ -1656,7 +1265,6 @@
           <w:szCs w:val="22"/>
         </w:rPr>
       </w:pPr>
-      <w:proofErr w:type="spellStart"/>
       <w:r>
         <w:rPr>
           <w:i/>
@@ -1664,49 +1272,8 @@
           <w:sz w:val="22"/>
           <w:szCs w:val="22"/>
         </w:rPr>
-        <w:t>Wassalamu'alaikum</w:t>
-      </w:r>
-      <w:proofErr w:type="spellEnd"/>
-      <w:r>
-        <w:rPr>
-          <w:i/>
-          <w:iCs/>
-          <w:sz w:val="22"/>
-          <w:szCs w:val="22"/>
-        </w:rPr>
-        <w:t xml:space="preserve"> </w:t>
-      </w:r>
-      <w:proofErr w:type="spellStart"/>
-      <w:r>
-        <w:rPr>
-          <w:i/>
-          <w:iCs/>
-          <w:sz w:val="22"/>
-          <w:szCs w:val="22"/>
-        </w:rPr>
-        <w:t>warahmatullaahi</w:t>
-      </w:r>
-      <w:proofErr w:type="spellEnd"/>
-      <w:r>
-        <w:rPr>
-          <w:i/>
-          <w:iCs/>
-          <w:sz w:val="22"/>
-          <w:szCs w:val="22"/>
-        </w:rPr>
-        <w:t xml:space="preserve"> </w:t>
-      </w:r>
-      <w:proofErr w:type="spellStart"/>
-      <w:r>
-        <w:rPr>
-          <w:i/>
-          <w:iCs/>
-          <w:sz w:val="22"/>
-          <w:szCs w:val="22"/>
-        </w:rPr>
-        <w:t>wabarakaatuh</w:t>
-      </w:r>
-      <w:proofErr w:type="spellEnd"/>
+        <w:t>Wassalamu'alaikum warahmatullaahi wabarakaatuh</w:t>
+      </w:r>
     </w:p>
     <w:p>
       <w:pPr>
@@ -1778,7 +1345,6 @@
                 <w:lang w:val="en-ID"/>
               </w:rPr>
             </w:pPr>
-            <w:proofErr w:type="spellStart"/>
             <w:r>
               <w:rPr>
                 <w:color w:val="000000"/>
@@ -1786,17 +1352,7 @@
                 <w:szCs w:val="22"/>
                 <w:lang w:val="en-ID"/>
               </w:rPr>
-              <w:t>Pemohon</w:t>
-            </w:r>
-            <w:proofErr w:type="spellEnd"/>
-            <w:r>
-              <w:rPr>
-                <w:color w:val="000000"/>
-                <w:sz w:val="22"/>
-                <w:szCs w:val="22"/>
-                <w:lang w:val="en-ID"/>
-              </w:rPr>
-              <w:t>,</w:t>
+              <w:t>Pemohon,</w:t>
             </w:r>
           </w:p>
         </w:tc>
@@ -1932,19 +1488,8 @@
                 <w:szCs w:val="22"/>
                 <w:lang w:val="en-ID"/>
               </w:rPr>
-              <w:t>-</w:t>
-            </w:r>
-            <w:proofErr w:type="spellStart"/>
-            <w:r>
-              <w:rPr>
-                <w:color w:val="000000"/>
-                <w:sz w:val="22"/>
-                <w:szCs w:val="22"/>
-                <w:lang w:val="en-ID"/>
-              </w:rPr>
-              <w:t>mhs</w:t>
-            </w:r>
-            <w:proofErr w:type="spellEnd"/>
+              <w:t>-mhs</w:t>
+            </w:r>
             <w:r>
               <w:rPr>
                 <w:color w:val="000000"/>
@@ -1979,7 +1524,6 @@
           <w:szCs w:val="22"/>
         </w:rPr>
       </w:pPr>
-      <w:proofErr w:type="spellStart"/>
       <w:r>
         <w:rPr>
           <w:b/>
@@ -1990,9 +1534,88 @@
           <w:szCs w:val="22"/>
           <w:u w:val="single"/>
         </w:rPr>
-        <w:t>Pemeriksaan</w:t>
-      </w:r>
-      <w:proofErr w:type="spellEnd"/>
+        <w:t>Pemeriksaan persyaratan</w:t>
+      </w:r>
+    </w:p>
+    <w:p>
+      <w:pPr>
+        <w:spacing w:after="40"/>
+        <w:jc w:val="both"/>
+        <w:rPr>
+          <w:sz w:val="22"/>
+          <w:szCs w:val="22"/>
+        </w:rPr>
+      </w:pPr>
+      <w:r>
+        <w:rPr>
+          <w:sz w:val="22"/>
+          <w:szCs w:val="22"/>
+        </w:rPr>
+        <w:t>Setelah diperiksa, mahasiswa tersebut di atas dinyatakan telah memenuhi persyaratan untuk melaksanakan penyusunan Tugas Akhir</w:t>
+      </w:r>
+    </w:p>
+    <w:p>
+      <w:pPr>
+        <w:spacing w:after="40"/>
+        <w:jc w:val="both"/>
+        <w:rPr>
+          <w:sz w:val="22"/>
+          <w:szCs w:val="22"/>
+        </w:rPr>
+      </w:pPr>
+    </w:p>
+    <w:p>
+      <w:pPr>
+        <w:rPr>
+          <w:sz w:val="22"/>
+          <w:szCs w:val="22"/>
+        </w:rPr>
+      </w:pPr>
+      <w:r>
+        <w:rPr>
+          <w:sz w:val="22"/>
+          <w:szCs w:val="22"/>
+        </w:rPr>
+        <w:t xml:space="preserve">Diperiksa oleh Tata Usaha tanggal: </w:t>
+      </w:r>
+      <w:r>
+        <w:rPr>
+          <w:sz w:val="22"/>
+          <w:szCs w:val="22"/>
+        </w:rPr>
+        <w:t>________________</w:t>
+      </w:r>
+      <w:r>
+        <w:rPr>
+          <w:sz w:val="22"/>
+          <w:szCs w:val="22"/>
+        </w:rPr>
+        <w:t xml:space="preserve"> (                                     </w:t>
+      </w:r>
+      <w:r>
+        <w:rPr>
+          <w:sz w:val="22"/>
+          <w:szCs w:val="22"/>
+        </w:rPr>
+        <w:t>)</w:t>
+      </w:r>
+    </w:p>
+    <w:p>
+      <w:pPr>
+        <w:rPr>
+          <w:sz w:val="22"/>
+          <w:szCs w:val="22"/>
+        </w:rPr>
+      </w:pPr>
+    </w:p>
+    <w:p>
+      <w:pPr>
+        <w:spacing w:after="40"/>
+        <w:rPr>
+          <w:sz w:val="22"/>
+          <w:szCs w:val="22"/>
+        </w:rPr>
+      </w:pPr>
       <w:r>
         <w:rPr>
           <w:b/>
@@ -2003,326 +1626,24 @@
           <w:szCs w:val="22"/>
           <w:u w:val="single"/>
         </w:rPr>
-        <w:t xml:space="preserve"> </w:t>
-      </w:r>
-      <w:proofErr w:type="spellStart"/>
-      <w:r>
-        <w:rPr>
-          <w:b/>
-          <w:bCs/>
-          <w:i/>
-          <w:iCs/>
-          <w:sz w:val="22"/>
-          <w:szCs w:val="22"/>
-          <w:u w:val="single"/>
-        </w:rPr>
-        <w:t>persyaratan</w:t>
-      </w:r>
-      <w:proofErr w:type="spellEnd"/>
+        <w:t>Persetujuan</w:t>
+      </w:r>
     </w:p>
     <w:p>
       <w:pPr>
         <w:spacing w:after="40"/>
-        <w:jc w:val="both"/>
-        <w:rPr>
-          <w:sz w:val="22"/>
-          <w:szCs w:val="22"/>
-        </w:rPr>
-      </w:pPr>
-      <w:r>
-        <w:rPr>
-          <w:sz w:val="22"/>
-          <w:szCs w:val="22"/>
-        </w:rPr>
-        <w:t xml:space="preserve">Setelah diperiksa, mahasiswa tersebut di </w:t>
-      </w:r>
-      <w:proofErr w:type="spellStart"/>
-      <w:r>
-        <w:rPr>
-          <w:sz w:val="22"/>
-          <w:szCs w:val="22"/>
-        </w:rPr>
-        <w:t>atas</w:t>
-      </w:r>
-      <w:proofErr w:type="spellEnd"/>
-      <w:r>
-        <w:rPr>
-          <w:sz w:val="22"/>
-          <w:szCs w:val="22"/>
-        </w:rPr>
-        <w:t xml:space="preserve"> </w:t>
-      </w:r>
-      <w:proofErr w:type="spellStart"/>
-      <w:r>
-        <w:rPr>
-          <w:sz w:val="22"/>
-          <w:szCs w:val="22"/>
-        </w:rPr>
-        <w:t>dinyatakan</w:t>
-      </w:r>
-      <w:proofErr w:type="spellEnd"/>
-      <w:r>
-        <w:rPr>
-          <w:sz w:val="22"/>
-          <w:szCs w:val="22"/>
-        </w:rPr>
-        <w:t xml:space="preserve"> </w:t>
-      </w:r>
-      <w:proofErr w:type="spellStart"/>
-      <w:r>
-        <w:rPr>
-          <w:sz w:val="22"/>
-          <w:szCs w:val="22"/>
-        </w:rPr>
-        <w:t>telah</w:t>
-      </w:r>
-      <w:proofErr w:type="spellEnd"/>
-      <w:r>
-        <w:rPr>
-          <w:sz w:val="22"/>
-          <w:szCs w:val="22"/>
-        </w:rPr>
-        <w:t xml:space="preserve"> </w:t>
-      </w:r>
-      <w:proofErr w:type="spellStart"/>
-      <w:r>
-        <w:rPr>
-          <w:sz w:val="22"/>
-          <w:szCs w:val="22"/>
-        </w:rPr>
-        <w:t>memenuhi</w:t>
-      </w:r>
-      <w:proofErr w:type="spellEnd"/>
-      <w:r>
-        <w:rPr>
-          <w:sz w:val="22"/>
-          <w:szCs w:val="22"/>
-        </w:rPr>
-        <w:t xml:space="preserve"> </w:t>
-      </w:r>
-      <w:proofErr w:type="spellStart"/>
-      <w:r>
-        <w:rPr>
-          <w:sz w:val="22"/>
-          <w:szCs w:val="22"/>
-        </w:rPr>
-        <w:t>persyaratan</w:t>
-      </w:r>
-      <w:proofErr w:type="spellEnd"/>
-      <w:r>
-        <w:rPr>
-          <w:sz w:val="22"/>
-          <w:szCs w:val="22"/>
-        </w:rPr>
-        <w:t xml:space="preserve"> </w:t>
-      </w:r>
-      <w:proofErr w:type="spellStart"/>
-      <w:r>
-        <w:rPr>
-          <w:sz w:val="22"/>
-          <w:szCs w:val="22"/>
-        </w:rPr>
-        <w:t>untuk</w:t>
-      </w:r>
-      <w:proofErr w:type="spellEnd"/>
-      <w:r>
-        <w:rPr>
-          <w:sz w:val="22"/>
-          <w:szCs w:val="22"/>
-        </w:rPr>
-        <w:t xml:space="preserve"> </w:t>
-      </w:r>
-      <w:proofErr w:type="spellStart"/>
-      <w:r>
-        <w:rPr>
-          <w:sz w:val="22"/>
-          <w:szCs w:val="22"/>
-        </w:rPr>
-        <w:t>melaksanakan</w:t>
-      </w:r>
-      <w:proofErr w:type="spellEnd"/>
-      <w:r>
-        <w:rPr>
-          <w:sz w:val="22"/>
-          <w:szCs w:val="22"/>
-        </w:rPr>
-        <w:t xml:space="preserve"> </w:t>
-      </w:r>
-      <w:proofErr w:type="spellStart"/>
-      <w:r>
-        <w:rPr>
-          <w:sz w:val="22"/>
-          <w:szCs w:val="22"/>
-        </w:rPr>
-        <w:t>penyusunan</w:t>
-      </w:r>
-      <w:proofErr w:type="spellEnd"/>
-      <w:r>
-        <w:rPr>
-          <w:sz w:val="22"/>
-          <w:szCs w:val="22"/>
-        </w:rPr>
-        <w:t xml:space="preserve"> </w:t>
-      </w:r>
-      <w:proofErr w:type="spellStart"/>
-      <w:r>
-        <w:rPr>
-          <w:sz w:val="22"/>
-          <w:szCs w:val="22"/>
-        </w:rPr>
-        <w:t>Tugas</w:t>
-      </w:r>
-      <w:proofErr w:type="spellEnd"/>
-      <w:r>
-        <w:rPr>
-          <w:sz w:val="22"/>
-          <w:szCs w:val="22"/>
-        </w:rPr>
-        <w:t xml:space="preserve"> Akhir</w:t>
-      </w:r>
-    </w:p>
-    <w:p>
-      <w:pPr>
-        <w:spacing w:after="40"/>
-        <w:jc w:val="both"/>
-        <w:rPr>
-          <w:sz w:val="22"/>
-          <w:szCs w:val="22"/>
-        </w:rPr>
-      </w:pPr>
-    </w:p>
-    <w:p>
-      <w:pPr>
-        <w:rPr>
-          <w:sz w:val="22"/>
-          <w:szCs w:val="22"/>
-        </w:rPr>
-      </w:pPr>
-      <w:r>
-        <w:rPr>
-          <w:sz w:val="22"/>
-          <w:szCs w:val="22"/>
-        </w:rPr>
-        <w:t xml:space="preserve">Diperiksa oleh Tata Usaha </w:t>
-      </w:r>
-      <w:proofErr w:type="spellStart"/>
-      <w:r>
-        <w:rPr>
-          <w:sz w:val="22"/>
-          <w:szCs w:val="22"/>
-        </w:rPr>
-        <w:t>tanggal</w:t>
-      </w:r>
-      <w:proofErr w:type="spellEnd"/>
-      <w:r>
-        <w:rPr>
-          <w:sz w:val="22"/>
-          <w:szCs w:val="22"/>
-        </w:rPr>
-        <w:t xml:space="preserve">: </w:t>
-      </w:r>
-      <w:r>
-        <w:rPr>
-          <w:sz w:val="22"/>
-          <w:szCs w:val="22"/>
-        </w:rPr>
-        <w:t>________________</w:t>
-      </w:r>
-      <w:r>
-        <w:rPr>
-          <w:sz w:val="22"/>
-          <w:szCs w:val="22"/>
-        </w:rPr>
-        <w:t xml:space="preserve"> </w:t>
-      </w:r>
-      <w:proofErr w:type="gramStart"/>
-      <w:r>
-        <w:rPr>
-          <w:sz w:val="22"/>
-          <w:szCs w:val="22"/>
-        </w:rPr>
-        <w:t xml:space="preserve">(  </w:t>
-      </w:r>
-      <w:proofErr w:type="gramEnd"/>
-      <w:r>
-        <w:rPr>
-          <w:sz w:val="22"/>
-          <w:szCs w:val="22"/>
-        </w:rPr>
-        <w:t xml:space="preserve">                                 </w:t>
-      </w:r>
-      <w:proofErr w:type="gramStart"/>
-      <w:r>
-        <w:rPr>
-          <w:sz w:val="22"/>
-          <w:szCs w:val="22"/>
-        </w:rPr>
-        <w:t xml:space="preserve">  </w:t>
-      </w:r>
-      <w:r>
-        <w:rPr>
-          <w:sz w:val="22"/>
-          <w:szCs w:val="22"/>
-        </w:rPr>
-        <w:t>)</w:t>
-      </w:r>
-      <w:proofErr w:type="gramEnd"/>
-    </w:p>
-    <w:p>
-      <w:pPr>
-        <w:rPr>
-          <w:sz w:val="22"/>
-          <w:szCs w:val="22"/>
-        </w:rPr>
-      </w:pPr>
-    </w:p>
-    <w:p>
-      <w:pPr>
-        <w:spacing w:after="40"/>
-        <w:rPr>
-          <w:sz w:val="22"/>
-          <w:szCs w:val="22"/>
-        </w:rPr>
-      </w:pPr>
-      <w:proofErr w:type="spellStart"/>
-      <w:r>
-        <w:rPr>
-          <w:b/>
-          <w:bCs/>
-          <w:i/>
-          <w:iCs/>
-          <w:sz w:val="22"/>
-          <w:szCs w:val="22"/>
-          <w:u w:val="single"/>
-        </w:rPr>
-        <w:t>Persetujuan</w:t>
-      </w:r>
-      <w:proofErr w:type="spellEnd"/>
-    </w:p>
-    <w:p>
-      <w:pPr>
-        <w:spacing w:after="40"/>
-        <w:rPr>
-          <w:sz w:val="22"/>
-          <w:szCs w:val="22"/>
-        </w:rPr>
-      </w:pPr>
-      <w:r>
-        <w:rPr>
-          <w:sz w:val="22"/>
-          <w:szCs w:val="22"/>
-        </w:rPr>
-        <w:t xml:space="preserve">Berdasarkan pemeriksaan di atas, permohonan saudara disetujui </w:t>
-      </w:r>
-      <w:proofErr w:type="gramStart"/>
-      <w:r>
-        <w:rPr>
-          <w:sz w:val="22"/>
-          <w:szCs w:val="22"/>
-        </w:rPr>
-        <w:t>dengan :</w:t>
-      </w:r>
-      <w:proofErr w:type="gramEnd"/>
+        <w:rPr>
+          <w:sz w:val="22"/>
+          <w:szCs w:val="22"/>
+        </w:rPr>
+      </w:pPr>
+      <w:r>
+        <w:rPr>
+          <w:sz w:val="22"/>
+          <w:szCs w:val="22"/>
+        </w:rPr>
+        <w:t>Berdasarkan pemeriksaan di atas, permohonan saudara disetujui dengan :</w:t>
+      </w:r>
     </w:p>
     <w:p>
       <w:pPr>
@@ -2389,7 +1710,6 @@
                 <w:lang w:val="en-ID"/>
               </w:rPr>
             </w:pPr>
-            <w:proofErr w:type="spellStart"/>
             <w:r>
               <w:rPr>
                 <w:b/>
@@ -2401,7 +1721,6 @@
               </w:rPr>
               <w:t>Menyetujui</w:t>
             </w:r>
-            <w:proofErr w:type="spellEnd"/>
           </w:p>
           <w:p>
             <w:pPr>
@@ -2425,31 +1744,7 @@
                 <w:szCs w:val="22"/>
                 <w:lang w:val="en-ID"/>
               </w:rPr>
-              <w:t xml:space="preserve">Dosen </w:t>
-            </w:r>
-            <w:proofErr w:type="spellStart"/>
-            <w:r>
-              <w:rPr>
-                <w:b/>
-                <w:bCs/>
-                <w:color w:val="000000"/>
-                <w:sz w:val="22"/>
-                <w:szCs w:val="22"/>
-                <w:lang w:val="en-ID"/>
-              </w:rPr>
-              <w:t>Pembimbing</w:t>
-            </w:r>
-            <w:proofErr w:type="spellEnd"/>
-            <w:r>
-              <w:rPr>
-                <w:b/>
-                <w:bCs/>
-                <w:color w:val="000000"/>
-                <w:sz w:val="22"/>
-                <w:szCs w:val="22"/>
-                <w:lang w:val="en-ID"/>
-              </w:rPr>
-              <w:t xml:space="preserve"> </w:t>
+              <w:t xml:space="preserve">Dosen Pembimbing </w:t>
             </w:r>
             <w:r>
               <w:rPr>
@@ -2489,7 +1784,6 @@
                 <w:lang w:val="en-ID"/>
               </w:rPr>
             </w:pPr>
-            <w:proofErr w:type="spellStart"/>
             <w:r>
               <w:rPr>
                 <w:b/>
@@ -2501,7 +1795,6 @@
               </w:rPr>
               <w:t>Menyetujui</w:t>
             </w:r>
-            <w:proofErr w:type="spellEnd"/>
           </w:p>
           <w:p>
             <w:pPr>
@@ -2525,31 +1818,7 @@
                 <w:szCs w:val="22"/>
                 <w:lang w:val="en-ID"/>
               </w:rPr>
-              <w:t xml:space="preserve">Dosen </w:t>
-            </w:r>
-            <w:proofErr w:type="spellStart"/>
-            <w:r>
-              <w:rPr>
-                <w:b/>
-                <w:bCs/>
-                <w:color w:val="000000"/>
-                <w:sz w:val="22"/>
-                <w:szCs w:val="22"/>
-                <w:lang w:val="en-ID"/>
-              </w:rPr>
-              <w:t>Pembimbing</w:t>
-            </w:r>
-            <w:proofErr w:type="spellEnd"/>
-            <w:r>
-              <w:rPr>
-                <w:b/>
-                <w:bCs/>
-                <w:color w:val="000000"/>
-                <w:sz w:val="22"/>
-                <w:szCs w:val="22"/>
-                <w:lang w:val="en-ID"/>
-              </w:rPr>
-              <w:t xml:space="preserve"> </w:t>
+              <w:t xml:space="preserve">Dosen Pembimbing </w:t>
             </w:r>
             <w:r>
               <w:rPr>
@@ -2663,7 +1932,6 @@
                 <w:lang w:val="en-ID"/>
               </w:rPr>
             </w:pPr>
-            <w:proofErr w:type="spellStart"/>
             <w:r>
               <w:rPr>
                 <w:color w:val="000000"/>
@@ -2673,7 +1941,6 @@
               </w:rPr>
               <w:t>Paraf</w:t>
             </w:r>
-            <w:proofErr w:type="spellEnd"/>
           </w:p>
         </w:tc>
         <w:tc>
@@ -2699,7 +1966,6 @@
                 <w:lang w:val="en-ID"/>
               </w:rPr>
             </w:pPr>
-            <w:proofErr w:type="spellStart"/>
             <w:r>
               <w:rPr>
                 <w:color w:val="000000"/>
@@ -2709,7 +1975,6 @@
               </w:rPr>
               <w:t>Paraf</w:t>
             </w:r>
-            <w:proofErr w:type="spellEnd"/>
           </w:p>
         </w:tc>
       </w:tr>
@@ -2781,21 +2046,12 @@
           <w:szCs w:val="22"/>
         </w:rPr>
       </w:pPr>
-      <w:proofErr w:type="gramStart"/>
-      <w:r>
-        <w:rPr>
-          <w:sz w:val="22"/>
-          <w:szCs w:val="22"/>
-        </w:rPr>
-        <w:t>Yogyakarta, {</w:t>
-      </w:r>
-      <w:proofErr w:type="gramEnd"/>
-      <w:r>
-        <w:rPr>
-          <w:sz w:val="22"/>
-          <w:szCs w:val="22"/>
-        </w:rPr>
-        <w:t>date}</w:t>
+      <w:r>
+        <w:rPr>
+          <w:sz w:val="22"/>
+          <w:szCs w:val="22"/>
+        </w:rPr>
+        <w:t>Yogyakarta, {date}</w:t>
       </w:r>
     </w:p>
     <w:p>
@@ -2807,21 +2063,12 @@
           <w:szCs w:val="22"/>
         </w:rPr>
       </w:pPr>
-      <w:proofErr w:type="spellStart"/>
-      <w:r>
-        <w:rPr>
-          <w:sz w:val="22"/>
-          <w:szCs w:val="22"/>
-        </w:rPr>
-        <w:t>Ketua</w:t>
-      </w:r>
-      <w:proofErr w:type="spellEnd"/>
-      <w:r>
-        <w:rPr>
-          <w:sz w:val="22"/>
-          <w:szCs w:val="22"/>
-        </w:rPr>
-        <w:t xml:space="preserve"> Program Studi</w:t>
+      <w:r>
+        <w:rPr>
+          <w:sz w:val="22"/>
+          <w:szCs w:val="22"/>
+        </w:rPr>
+        <w:t>Ketua Program Studi</w:t>
       </w:r>
     </w:p>
     <w:p>
@@ -2866,7 +2113,6 @@
         </w:rPr>
         <w:t>%</w:t>
       </w:r>
-      <w:proofErr w:type="spellStart"/>
       <w:r>
         <w:rPr>
           <w:sz w:val="22"/>
@@ -2874,7 +2120,6 @@
         </w:rPr>
         <w:t>ttd-kaprodi</w:t>
       </w:r>
-      <w:proofErr w:type="spellEnd"/>
       <w:r>
         <w:rPr>
           <w:sz w:val="22"/>
@@ -2917,7 +2162,6 @@
         </w:rPr>
         <w:t>{</w:t>
       </w:r>
-      <w:proofErr w:type="spellStart"/>
       <w:r>
         <w:rPr>
           <w:sz w:val="22"/>
@@ -2925,7 +2169,6 @@
         </w:rPr>
         <w:t>kaprodi-tertuju</w:t>
       </w:r>
-      <w:proofErr w:type="spellEnd"/>
       <w:r>
         <w:rPr>
           <w:sz w:val="22"/>
@@ -2994,7 +2237,6 @@
           <w:szCs w:val="20"/>
         </w:rPr>
       </w:pPr>
-      <w:proofErr w:type="spellStart"/>
       <w:r>
         <w:rPr>
           <w:b/>
@@ -3005,7 +2247,6 @@
         </w:rPr>
         <w:t>Catatan</w:t>
       </w:r>
-      <w:proofErr w:type="spellEnd"/>
     </w:p>
     <w:p>
       <w:pPr>
@@ -3022,152 +2263,22 @@
           <w:i/>
           <w:iCs/>
         </w:rPr>
-        <w:t>1.  Pelaksanaan Tugas Akhir minimal 3 (</w:t>
-      </w:r>
-      <w:proofErr w:type="spellStart"/>
+        <w:t>1.  Pelaksanaan Tugas Akhir minimal 3 (tiga</w:t>
+      </w:r>
       <w:r>
         <w:rPr>
           <w:i/>
           <w:iCs/>
         </w:rPr>
-        <w:t>tiga</w:t>
-      </w:r>
-      <w:proofErr w:type="spellEnd"/>
+        <w:t>}</w:t>
+      </w:r>
       <w:r>
         <w:rPr>
           <w:i/>
           <w:iCs/>
         </w:rPr>
-        <w:t>}</w:t>
-      </w:r>
-      <w:r>
-        <w:rPr>
-          <w:i/>
-          <w:iCs/>
-        </w:rPr>
-        <w:t xml:space="preserve"> </w:t>
-      </w:r>
-      <w:proofErr w:type="spellStart"/>
-      <w:r>
-        <w:rPr>
-          <w:i/>
-          <w:iCs/>
-        </w:rPr>
-        <w:t>bulan</w:t>
-      </w:r>
-      <w:proofErr w:type="spellEnd"/>
-      <w:r>
-        <w:rPr>
-          <w:i/>
-          <w:iCs/>
-        </w:rPr>
-        <w:t xml:space="preserve"> dan </w:t>
-      </w:r>
-      <w:proofErr w:type="spellStart"/>
-      <w:r>
-        <w:rPr>
-          <w:i/>
-          <w:iCs/>
-        </w:rPr>
-        <w:t>maksimal</w:t>
-      </w:r>
-      <w:proofErr w:type="spellEnd"/>
-      <w:r>
-        <w:rPr>
-          <w:i/>
-          <w:iCs/>
-        </w:rPr>
-        <w:t xml:space="preserve"> 1 semester, apabila lebih dari 1 semester akan dikenakan biaya Tugas Akhir baru (dihitung dari </w:t>
-      </w:r>
-      <w:proofErr w:type="spellStart"/>
-      <w:r>
-        <w:rPr>
-          <w:i/>
-          <w:iCs/>
-        </w:rPr>
-        <w:t>tanggal</w:t>
-      </w:r>
-      <w:proofErr w:type="spellEnd"/>
-      <w:r>
-        <w:rPr>
-          <w:i/>
-          <w:iCs/>
-        </w:rPr>
-        <w:t xml:space="preserve"> </w:t>
-      </w:r>
-      <w:proofErr w:type="spellStart"/>
-      <w:r>
-        <w:rPr>
-          <w:i/>
-          <w:iCs/>
-        </w:rPr>
-        <w:t>persetujuan</w:t>
-      </w:r>
-      <w:proofErr w:type="spellEnd"/>
-      <w:r>
-        <w:rPr>
-          <w:i/>
-          <w:iCs/>
-        </w:rPr>
-        <w:t xml:space="preserve"> </w:t>
-      </w:r>
-      <w:proofErr w:type="spellStart"/>
-      <w:r>
-        <w:rPr>
-          <w:i/>
-          <w:iCs/>
-        </w:rPr>
-        <w:t>permohonan</w:t>
-      </w:r>
-      <w:proofErr w:type="spellEnd"/>
-      <w:r>
-        <w:rPr>
-          <w:i/>
-          <w:iCs/>
-        </w:rPr>
-        <w:t xml:space="preserve"> </w:t>
-      </w:r>
-      <w:proofErr w:type="spellStart"/>
-      <w:r>
-        <w:rPr>
-          <w:i/>
-          <w:iCs/>
-        </w:rPr>
-        <w:t>Tugas</w:t>
-      </w:r>
-      <w:proofErr w:type="spellEnd"/>
-      <w:r>
-        <w:rPr>
-          <w:i/>
-          <w:iCs/>
-        </w:rPr>
-        <w:t xml:space="preserve"> Akhir oleh </w:t>
-      </w:r>
-      <w:proofErr w:type="spellStart"/>
-      <w:r>
-        <w:rPr>
-          <w:i/>
-          <w:iCs/>
-        </w:rPr>
-        <w:t>Ketua</w:t>
-      </w:r>
-      <w:proofErr w:type="spellEnd"/>
-      <w:r>
-        <w:rPr>
-          <w:i/>
-          <w:iCs/>
-        </w:rPr>
-        <w:t xml:space="preserve"> </w:t>
-      </w:r>
-      <w:proofErr w:type="spellStart"/>
-      <w:r>
-        <w:rPr>
-          <w:i/>
-          <w:iCs/>
-        </w:rPr>
-        <w:t>Jurusan</w:t>
-      </w:r>
-      <w:proofErr w:type="spellEnd"/>
+        <w:t xml:space="preserve"> bulan dan maksimal 1 semester, apabila lebih dari 1 semester akan dikenakan biaya Tugas Akhir baru (dihitung dari tanggal persetujuan permohonan Tugas Akhir oleh Ketua Jurusan</w:t>
+      </w:r>
       <w:r>
         <w:rPr>
           <w:i/>

</xml_diff>